<commit_message>
auto: push changes 26-04-Sun_19-32-03
</commit_message>
<xml_diff>
--- a/Generateur Des Factures/Factures/Facture numéro 1-2026.docx
+++ b/Generateur Des Factures/Factures/Facture numéro 1-2026.docx
@@ -380,7 +380,79 @@
                 <w:szCs w:val="24"/>
                 <w:lang w:val="fr-FR"/>
               </w:rPr>
-              <w:t>12 rue sabri boujemaa 1er etg N 6,  Casablanca 20150</w:t>
+              <w:t xml:space="preserve">12 rue </w:t>
+            </w:r>
+            <w:proofErr w:type="spellStart"/>
+            <w:r>
+              <w:rPr>
+                <w:rFonts w:ascii="Aptos" w:eastAsia="+mn-ea" w:hAnsi="Aptos" w:cs="+mn-cs"/>
+                <w:color w:val="000000"/>
+                <w:kern w:val="24"/>
+                <w:sz w:val="24"/>
+                <w:szCs w:val="24"/>
+                <w:lang w:val="fr-FR"/>
+              </w:rPr>
+              <w:t>sabri</w:t>
+            </w:r>
+            <w:proofErr w:type="spellEnd"/>
+            <w:r>
+              <w:rPr>
+                <w:rFonts w:ascii="Aptos" w:eastAsia="+mn-ea" w:hAnsi="Aptos" w:cs="+mn-cs"/>
+                <w:color w:val="000000"/>
+                <w:kern w:val="24"/>
+                <w:sz w:val="24"/>
+                <w:szCs w:val="24"/>
+                <w:lang w:val="fr-FR"/>
+              </w:rPr>
+              <w:t xml:space="preserve"> </w:t>
+            </w:r>
+            <w:proofErr w:type="spellStart"/>
+            <w:r>
+              <w:rPr>
+                <w:rFonts w:ascii="Aptos" w:eastAsia="+mn-ea" w:hAnsi="Aptos" w:cs="+mn-cs"/>
+                <w:color w:val="000000"/>
+                <w:kern w:val="24"/>
+                <w:sz w:val="24"/>
+                <w:szCs w:val="24"/>
+                <w:lang w:val="fr-FR"/>
+              </w:rPr>
+              <w:t>boujemaa</w:t>
+            </w:r>
+            <w:proofErr w:type="spellEnd"/>
+            <w:r>
+              <w:rPr>
+                <w:rFonts w:ascii="Aptos" w:eastAsia="+mn-ea" w:hAnsi="Aptos" w:cs="+mn-cs"/>
+                <w:color w:val="000000"/>
+                <w:kern w:val="24"/>
+                <w:sz w:val="24"/>
+                <w:szCs w:val="24"/>
+                <w:lang w:val="fr-FR"/>
+              </w:rPr>
+              <w:t xml:space="preserve"> 1er </w:t>
+            </w:r>
+            <w:proofErr w:type="spellStart"/>
+            <w:r>
+              <w:rPr>
+                <w:rFonts w:ascii="Aptos" w:eastAsia="+mn-ea" w:hAnsi="Aptos" w:cs="+mn-cs"/>
+                <w:color w:val="000000"/>
+                <w:kern w:val="24"/>
+                <w:sz w:val="24"/>
+                <w:szCs w:val="24"/>
+                <w:lang w:val="fr-FR"/>
+              </w:rPr>
+              <w:t>etg</w:t>
+            </w:r>
+            <w:proofErr w:type="spellEnd"/>
+            <w:r>
+              <w:rPr>
+                <w:rFonts w:ascii="Aptos" w:eastAsia="+mn-ea" w:hAnsi="Aptos" w:cs="+mn-cs"/>
+                <w:color w:val="000000"/>
+                <w:kern w:val="24"/>
+                <w:sz w:val="24"/>
+                <w:szCs w:val="24"/>
+                <w:lang w:val="fr-FR"/>
+              </w:rPr>
+              <w:t xml:space="preserve"> N 6,  Casablanca 20150</w:t>
             </w:r>
           </w:p>
         </w:tc>
@@ -1423,6 +1495,73 @@
         <w:rPr>
           <w:noProof/>
         </w:rPr>
+        <w:drawing>
+          <wp:anchor distT="0" distB="0" distL="114300" distR="114300" simplePos="0" relativeHeight="251669504" behindDoc="1" locked="0" layoutInCell="1" allowOverlap="1" wp14:anchorId="56236D3F" wp14:editId="7613AE64">
+            <wp:simplePos x="0" y="0"/>
+            <wp:positionH relativeFrom="column">
+              <wp:posOffset>4679950</wp:posOffset>
+            </wp:positionH>
+            <wp:positionV relativeFrom="paragraph">
+              <wp:posOffset>139700</wp:posOffset>
+            </wp:positionV>
+            <wp:extent cx="1587500" cy="683260"/>
+            <wp:effectExtent l="38100" t="76200" r="50800" b="97790"/>
+            <wp:wrapNone/>
+            <wp:docPr id="1246332295" name="Picture 2"/>
+            <wp:cNvGraphicFramePr>
+              <a:graphicFrameLocks xmlns:a="http://schemas.openxmlformats.org/drawingml/2006/main" noChangeAspect="1"/>
+            </wp:cNvGraphicFramePr>
+            <a:graphic xmlns:a="http://schemas.openxmlformats.org/drawingml/2006/main">
+              <a:graphicData uri="http://schemas.openxmlformats.org/drawingml/2006/picture">
+                <pic:pic xmlns:pic="http://schemas.openxmlformats.org/drawingml/2006/picture">
+                  <pic:nvPicPr>
+                    <pic:cNvPr id="0" name="Picture 3"/>
+                    <pic:cNvPicPr>
+                      <a:picLocks noChangeAspect="1" noChangeArrowheads="1"/>
+                    </pic:cNvPicPr>
+                  </pic:nvPicPr>
+                  <pic:blipFill>
+                    <a:blip r:embed="rId9" cstate="print">
+                      <a:extLst>
+                        <a:ext uri="{28A0092B-C50C-407E-A947-70E740481C1C}">
+                          <a14:useLocalDpi xmlns:a14="http://schemas.microsoft.com/office/drawing/2010/main" val="0"/>
+                        </a:ext>
+                      </a:extLst>
+                    </a:blip>
+                    <a:srcRect/>
+                    <a:stretch>
+                      <a:fillRect/>
+                    </a:stretch>
+                  </pic:blipFill>
+                  <pic:spPr bwMode="auto">
+                    <a:xfrm rot="406662">
+                      <a:off x="0" y="0"/>
+                      <a:ext cx="1587500" cy="683260"/>
+                    </a:xfrm>
+                    <a:prstGeom prst="rect">
+                      <a:avLst/>
+                    </a:prstGeom>
+                    <a:noFill/>
+                    <a:ln>
+                      <a:noFill/>
+                    </a:ln>
+                  </pic:spPr>
+                </pic:pic>
+              </a:graphicData>
+            </a:graphic>
+            <wp14:sizeRelH relativeFrom="margin">
+              <wp14:pctWidth>0</wp14:pctWidth>
+            </wp14:sizeRelH>
+            <wp14:sizeRelV relativeFrom="margin">
+              <wp14:pctHeight>0</wp14:pctHeight>
+            </wp14:sizeRelV>
+          </wp:anchor>
+        </w:drawing>
+      </w:r>
+      <w:r>
+        <w:rPr>
+          <w:noProof/>
+        </w:rPr>
         <w:t xml:space="preserve"> </w:t>
       </w:r>
       <w:bookmarkEnd w:id="1"/>
@@ -1431,12 +1570,12 @@
     </w:p>
     <w:p/>
     <w:sectPr>
-      <w:headerReference w:type="even" r:id="rId9"/>
-      <w:headerReference w:type="default" r:id="rId10"/>
-      <w:footerReference w:type="even" r:id="rId11"/>
-      <w:footerReference w:type="default" r:id="rId12"/>
-      <w:headerReference w:type="first" r:id="rId13"/>
-      <w:footerReference w:type="first" r:id="rId14"/>
+      <w:headerReference w:type="even" r:id="rId10"/>
+      <w:headerReference w:type="default" r:id="rId11"/>
+      <w:footerReference w:type="even" r:id="rId12"/>
+      <w:footerReference w:type="default" r:id="rId13"/>
+      <w:headerReference w:type="first" r:id="rId14"/>
+      <w:footerReference w:type="first" r:id="rId15"/>
       <w:pgSz w:w="11906" w:h="16838"/>
       <w:pgMar w:top="1170" w:right="1417" w:bottom="1417" w:left="1417" w:header="708" w:footer="0" w:gutter="0"/>
       <w:cols w:space="708"/>
@@ -1512,7 +1651,51 @@
         <w:vertAlign w:val="superscript"/>
         <w:lang w:val="x-none" w:eastAsia="x-none"/>
       </w:rPr>
-      <w:t>Art 91 – II – 1° du Code Général des Impôts.</w:t>
+      <w:t xml:space="preserve">Art 91 – II – 1° du Code </w:t>
+    </w:r>
+    <w:proofErr w:type="spellStart"/>
+    <w:r>
+      <w:rPr>
+        <w:rFonts w:ascii="Calibri" w:eastAsia="Calibri" w:hAnsi="Calibri" w:cs="Times New Roman"/>
+        <w:sz w:val="26"/>
+        <w:szCs w:val="26"/>
+        <w:vertAlign w:val="superscript"/>
+        <w:lang w:val="x-none" w:eastAsia="x-none"/>
+      </w:rPr>
+      <w:t>Général</w:t>
+    </w:r>
+    <w:proofErr w:type="spellEnd"/>
+    <w:r>
+      <w:rPr>
+        <w:rFonts w:ascii="Calibri" w:eastAsia="Calibri" w:hAnsi="Calibri" w:cs="Times New Roman"/>
+        <w:sz w:val="26"/>
+        <w:szCs w:val="26"/>
+        <w:vertAlign w:val="superscript"/>
+        <w:lang w:val="x-none" w:eastAsia="x-none"/>
+      </w:rPr>
+      <w:t xml:space="preserve"> des </w:t>
+    </w:r>
+    <w:proofErr w:type="spellStart"/>
+    <w:r>
+      <w:rPr>
+        <w:rFonts w:ascii="Calibri" w:eastAsia="Calibri" w:hAnsi="Calibri" w:cs="Times New Roman"/>
+        <w:sz w:val="26"/>
+        <w:szCs w:val="26"/>
+        <w:vertAlign w:val="superscript"/>
+        <w:lang w:val="x-none" w:eastAsia="x-none"/>
+      </w:rPr>
+      <w:t>Impôts</w:t>
+    </w:r>
+    <w:proofErr w:type="spellEnd"/>
+    <w:r>
+      <w:rPr>
+        <w:rFonts w:ascii="Calibri" w:eastAsia="Calibri" w:hAnsi="Calibri" w:cs="Times New Roman"/>
+        <w:sz w:val="26"/>
+        <w:szCs w:val="26"/>
+        <w:vertAlign w:val="superscript"/>
+        <w:lang w:val="x-none" w:eastAsia="x-none"/>
+      </w:rPr>
+      <w:t>.</w:t>
     </w:r>
     <w:r>
       <w:rPr>

</xml_diff>

<commit_message>
auto: push changes 26-04-Sun_23-36-12
</commit_message>
<xml_diff>
--- a/Generateur Des Factures/Factures/Facture numéro 1-2026.docx
+++ b/Generateur Des Factures/Factures/Facture numéro 1-2026.docx
@@ -60,33 +60,7 @@
                 <w:szCs w:val="24"/>
                 <w:lang w:val="fr-FR" w:eastAsia="fr-MA"/>
               </w:rPr>
-              <w:t xml:space="preserve">Facture numéro :  </w:t>
-            </w:r>
-            <w:r>
-              <w:rPr>
-                <w:rFonts w:ascii="Aptos" w:eastAsia="Times New Roman" w:hAnsi="Aptos" w:cs="Arial"/>
-                <w:b/>
-                <w:bCs/>
-                <w:color w:val="000000"/>
-                <w:kern w:val="24"/>
-                <w:sz w:val="24"/>
-                <w:szCs w:val="24"/>
-                <w:lang w:val="fr-FR" w:eastAsia="fr-MA"/>
-              </w:rPr>
-              <w:t>1</w:t>
-            </w:r>
-            <w:r>
-              <w:rPr>
-                <w:rFonts w:ascii="Aptos" w:eastAsia="Times New Roman" w:hAnsi="Aptos" w:cs="Arial"/>
-                <w:b/>
-                <w:bCs/>
-                <w:color w:val="000000"/>
-                <w:kern w:val="24"/>
-                <w:sz w:val="24"/>
-                <w:szCs w:val="24"/>
-                <w:lang w:val="fr-FR" w:eastAsia="fr-MA"/>
-              </w:rPr>
-              <w:t>/2026</w:t>
+              <w:t>Facture numéro :  1/2026</w:t>
             </w:r>
           </w:p>
         </w:tc>
@@ -134,7 +108,7 @@
                 <w:szCs w:val="24"/>
                 <w:lang w:val="fr-FR" w:eastAsia="fr-MA"/>
               </w:rPr>
-              <w:t>Date : 09/04/2026</w:t>
+              <w:t>Date : 26/04/2026</w:t>
             </w:r>
           </w:p>
         </w:tc>
@@ -380,79 +354,7 @@
                 <w:szCs w:val="24"/>
                 <w:lang w:val="fr-FR"/>
               </w:rPr>
-              <w:t xml:space="preserve">12 rue </w:t>
-            </w:r>
-            <w:proofErr w:type="spellStart"/>
-            <w:r>
-              <w:rPr>
-                <w:rFonts w:ascii="Aptos" w:eastAsia="+mn-ea" w:hAnsi="Aptos" w:cs="+mn-cs"/>
-                <w:color w:val="000000"/>
-                <w:kern w:val="24"/>
-                <w:sz w:val="24"/>
-                <w:szCs w:val="24"/>
-                <w:lang w:val="fr-FR"/>
-              </w:rPr>
-              <w:t>sabri</w:t>
-            </w:r>
-            <w:proofErr w:type="spellEnd"/>
-            <w:r>
-              <w:rPr>
-                <w:rFonts w:ascii="Aptos" w:eastAsia="+mn-ea" w:hAnsi="Aptos" w:cs="+mn-cs"/>
-                <w:color w:val="000000"/>
-                <w:kern w:val="24"/>
-                <w:sz w:val="24"/>
-                <w:szCs w:val="24"/>
-                <w:lang w:val="fr-FR"/>
-              </w:rPr>
-              <w:t xml:space="preserve"> </w:t>
-            </w:r>
-            <w:proofErr w:type="spellStart"/>
-            <w:r>
-              <w:rPr>
-                <w:rFonts w:ascii="Aptos" w:eastAsia="+mn-ea" w:hAnsi="Aptos" w:cs="+mn-cs"/>
-                <w:color w:val="000000"/>
-                <w:kern w:val="24"/>
-                <w:sz w:val="24"/>
-                <w:szCs w:val="24"/>
-                <w:lang w:val="fr-FR"/>
-              </w:rPr>
-              <w:t>boujemaa</w:t>
-            </w:r>
-            <w:proofErr w:type="spellEnd"/>
-            <w:r>
-              <w:rPr>
-                <w:rFonts w:ascii="Aptos" w:eastAsia="+mn-ea" w:hAnsi="Aptos" w:cs="+mn-cs"/>
-                <w:color w:val="000000"/>
-                <w:kern w:val="24"/>
-                <w:sz w:val="24"/>
-                <w:szCs w:val="24"/>
-                <w:lang w:val="fr-FR"/>
-              </w:rPr>
-              <w:t xml:space="preserve"> 1er </w:t>
-            </w:r>
-            <w:proofErr w:type="spellStart"/>
-            <w:r>
-              <w:rPr>
-                <w:rFonts w:ascii="Aptos" w:eastAsia="+mn-ea" w:hAnsi="Aptos" w:cs="+mn-cs"/>
-                <w:color w:val="000000"/>
-                <w:kern w:val="24"/>
-                <w:sz w:val="24"/>
-                <w:szCs w:val="24"/>
-                <w:lang w:val="fr-FR"/>
-              </w:rPr>
-              <w:t>etg</w:t>
-            </w:r>
-            <w:proofErr w:type="spellEnd"/>
-            <w:r>
-              <w:rPr>
-                <w:rFonts w:ascii="Aptos" w:eastAsia="+mn-ea" w:hAnsi="Aptos" w:cs="+mn-cs"/>
-                <w:color w:val="000000"/>
-                <w:kern w:val="24"/>
-                <w:sz w:val="24"/>
-                <w:szCs w:val="24"/>
-                <w:lang w:val="fr-FR"/>
-              </w:rPr>
-              <w:t xml:space="preserve"> N 6,  Casablanca 20150</w:t>
+              <w:t>12 rue sabri boujemaa 1er etg N 6,  Casablanca 20150</w:t>
             </w:r>
           </w:p>
         </w:tc>
@@ -1495,17 +1397,28 @@
         <w:rPr>
           <w:noProof/>
         </w:rPr>
+        <w:t xml:space="preserve"> </w:t>
+      </w:r>
+      <w:bookmarkEnd w:id="1"/>
+      <w:bookmarkEnd w:id="2"/>
+      <w:bookmarkEnd w:id="6"/>
+    </w:p>
+    <w:p>
+      <w:r>
+        <w:rPr>
+          <w:noProof/>
+        </w:rPr>
         <w:drawing>
-          <wp:anchor distT="0" distB="0" distL="114300" distR="114300" simplePos="0" relativeHeight="251669504" behindDoc="1" locked="0" layoutInCell="1" allowOverlap="1" wp14:anchorId="56236D3F" wp14:editId="7613AE64">
+          <wp:anchor distT="0" distB="0" distL="114300" distR="114300" simplePos="0" relativeHeight="251669504" behindDoc="1" locked="0" layoutInCell="1" allowOverlap="1" wp14:anchorId="045ED61C" wp14:editId="499A08AC">
             <wp:simplePos x="0" y="0"/>
             <wp:positionH relativeFrom="column">
-              <wp:posOffset>4679950</wp:posOffset>
+              <wp:posOffset>4572767</wp:posOffset>
             </wp:positionH>
             <wp:positionV relativeFrom="paragraph">
-              <wp:posOffset>139700</wp:posOffset>
+              <wp:posOffset>7784</wp:posOffset>
             </wp:positionV>
             <wp:extent cx="1587500" cy="683260"/>
-            <wp:effectExtent l="38100" t="76200" r="50800" b="97790"/>
+            <wp:effectExtent l="57150" t="228600" r="69850" b="250190"/>
             <wp:wrapNone/>
             <wp:docPr id="1246332295" name="Picture 2"/>
             <wp:cNvGraphicFramePr>
@@ -1534,7 +1447,7 @@
                     </a:stretch>
                   </pic:blipFill>
                   <pic:spPr bwMode="auto">
-                    <a:xfrm rot="406662">
+                    <a:xfrm rot="1174000">
                       <a:off x="0" y="0"/>
                       <a:ext cx="1587500" cy="683260"/>
                     </a:xfrm>
@@ -1558,17 +1471,7 @@
           </wp:anchor>
         </w:drawing>
       </w:r>
-      <w:r>
-        <w:rPr>
-          <w:noProof/>
-        </w:rPr>
-        <w:t xml:space="preserve"> </w:t>
-      </w:r>
-      <w:bookmarkEnd w:id="1"/>
-      <w:bookmarkEnd w:id="2"/>
-      <w:bookmarkEnd w:id="6"/>
     </w:p>
-    <w:p/>
     <w:sectPr>
       <w:headerReference w:type="even" r:id="rId10"/>
       <w:headerReference w:type="default" r:id="rId11"/>

</xml_diff>